<commit_message>
docs: record successful voice validation
Signed-off-by: Yjwqj <qjhya08@gmail.com>
</commit_message>
<xml_diff>
--- a/submission/VelaPlan-作品介绍文档.docx
+++ b/submission/VelaPlan-作品介绍文档.docx
@@ -42,7 +42,7 @@
     <w:p>
       <w:pPr/>
       <w:r>
-        <w:t>截至 2026 年 9 月 17 日，统一计划快应用、健康数据流程、语音转写代码、AI 兜底计划和发布版 RPK 已完成本地验证。6 组 JavaScript 测试与 3 个日志导出器回归测试通过，发布包已安装并运行在官方模拟器。AI Coding 日志已按组委会 schema 导出并通过官方校验。构建工具仍提示 system.velaclaw 为未知功能，因此演示必须如实保留本地规则兜底提示。当前只缺有效新密钥的真实语音成功记录和参赛者录制的 Demo 视频。</w:t>
+        <w:t>截至 2026 年 9 月 18 日，快应用、健康数据、真实 MiMo 语音转写、本地规则计划和发布版 RPK 均已验证。6 组 JavaScript 测试、3 个日志导出器测试及官方日志校验通过。system.velaclaw 仍有工具链警告，演示必须保留本地规则兜底提示；当前只缺 Demo 视频。</w:t>
       </w:r>
     </w:p>
     <w:p>
@@ -342,7 +342,7 @@
         <w:pStyle w:val="ListBullet"/>
       </w:pPr>
       <w:r>
-        <w:t>Token 消耗：日志封存时 Codex 为 134,334,527 tokens，Claude Code 环境检查为 3,509 tokens，合计 134,338,036 tokens；原始统计保存在 logs/Yjwqj/manifest.json。MiMo 语音暂没有可确认成功调用，不虚构云端 Token。</w:t>
+        <w:t>Token 消耗：Codex 134,334,527，Claude Code 3,509，合计 134,338,036 tokens，原始统计见 logs/Yjwqj/manifest.json。MiMo 语音已真实成功调用，音频 Token 和费用以平台账单为准。</w:t>
       </w:r>
     </w:p>
     <w:p>
@@ -386,7 +386,7 @@
     <w:p>
       <w:pPr/>
       <w:r>
-        <w:t>截至 2026 年 9 月 17 日，npm test 的 planner、plan store、MiMo 客户端、页面布局、语音转写和语音页面生命周期 6 组测试均通过；Codex 日志导出器的 3 个 Python 回归测试通过；npm run release 已生成生产 RPK。</w:t>
+        <w:t>截至 2026 年 9 月 18 日，npm test 的 planner、plan store、MiMo 客户端、页面布局、语音转写和语音页面生命周期 6 组测试均通过；Codex 日志导出器的 3 个 Python 回归测试通过；npm run release 已生成生产 RPK。</w:t>
       </w:r>
     </w:p>
     <w:p>
@@ -416,7 +416,7 @@
     <w:p>
       <w:pPr/>
       <w:r>
-        <w:t>当前发布包副本为 submission/VelaPlan.release.rpk，SHA-256 为 DB5E3665DE346D6BE54EF0CF5CB8164F284BC0EC53143A0B14E8339EDC012082。最终视频须展示健康数据、周期/提醒/天气设置、目标输入、计划生成、健康状态影响、任务完成和复盘，并控制在 5 分钟以内。</w:t>
+        <w:t>发布包 submission/VelaPlan.release.rpk 的 SHA-256 为 DB5E3665DE346D6BE54EF0CF5CB8164F284BC0EC53143A0B14E8339EDC012082，设备端真实 MiMo 语音转写已验收。最终视频须展示语音目标、状态感知计划、执行和复盘，并控制在 5 分钟以内。</w:t>
       </w:r>
     </w:p>
     <w:p>
@@ -430,7 +430,7 @@
     <w:p>
       <w:pPr/>
       <w:r>
-        <w:t>作品遵循 Apache 2.0，不提交密钥、私钥、.env、编译缓存或未授权素材，不宣传医疗诊断。尚需真实语音验收、5 分钟内视频及 PR #1 合入；若语音失败，视频如实使用文字输入。</w:t>
+        <w:t>作品遵循 Apache 2.0，不提交密钥、私钥、.env、编译缓存或未授权素材，不宣传医疗诊断。真实语音转写已经验收；当前只需录制 5 分钟内视频并等待 PR #1 合入。</w:t>
       </w:r>
     </w:p>
     <w:sectPr>

</xml_diff>